<commit_message>
Changes made to Rock Paper Scissors
</commit_message>
<xml_diff>
--- a/Javascript learning process - Documentation.docx
+++ b/Javascript learning process - Documentation.docx
@@ -517,6 +517,431 @@
                     <a:ln>
                       <a:noFill/>
                     </a:ln>
+                  </pic:spPr>
+                </pic:pic>
+              </a:graphicData>
+            </a:graphic>
+          </wp:inline>
+        </w:drawing>
+      </w:r>
+    </w:p>
+    <w:p/>
+    <w:p>
+      <w:r>
+        <w:drawing>
+          <wp:inline distT="0" distB="0" distL="0" distR="0" wp14:anchorId="60D91176" wp14:editId="0C0178BD">
+            <wp:extent cx="2127556" cy="2686973"/>
+            <wp:effectExtent l="0" t="0" r="6350" b="0"/>
+            <wp:docPr id="845947109" name="Picture 1"/>
+            <wp:cNvGraphicFramePr>
+              <a:graphicFrameLocks xmlns:a="http://schemas.openxmlformats.org/drawingml/2006/main" noChangeAspect="1"/>
+            </wp:cNvGraphicFramePr>
+            <a:graphic xmlns:a="http://schemas.openxmlformats.org/drawingml/2006/main">
+              <a:graphicData uri="http://schemas.openxmlformats.org/drawingml/2006/picture">
+                <pic:pic xmlns:pic="http://schemas.openxmlformats.org/drawingml/2006/picture">
+                  <pic:nvPicPr>
+                    <pic:cNvPr id="845947109" name=""/>
+                    <pic:cNvPicPr/>
+                  </pic:nvPicPr>
+                  <pic:blipFill>
+                    <a:blip r:embed="rId14"/>
+                    <a:stretch>
+                      <a:fillRect/>
+                    </a:stretch>
+                  </pic:blipFill>
+                  <pic:spPr>
+                    <a:xfrm>
+                      <a:off x="0" y="0"/>
+                      <a:ext cx="2155101" cy="2721761"/>
+                    </a:xfrm>
+                    <a:prstGeom prst="rect">
+                      <a:avLst/>
+                    </a:prstGeom>
+                  </pic:spPr>
+                </pic:pic>
+              </a:graphicData>
+            </a:graphic>
+          </wp:inline>
+        </w:drawing>
+      </w:r>
+      <w:r>
+        <w:t xml:space="preserve">   </w:t>
+      </w:r>
+      <w:r>
+        <w:drawing>
+          <wp:inline distT="0" distB="0" distL="0" distR="0" wp14:anchorId="4FB55F16" wp14:editId="312920CB">
+            <wp:extent cx="3399905" cy="2686050"/>
+            <wp:effectExtent l="0" t="0" r="0" b="0"/>
+            <wp:docPr id="1239905405" name="Picture 1"/>
+            <wp:cNvGraphicFramePr>
+              <a:graphicFrameLocks xmlns:a="http://schemas.openxmlformats.org/drawingml/2006/main" noChangeAspect="1"/>
+            </wp:cNvGraphicFramePr>
+            <a:graphic xmlns:a="http://schemas.openxmlformats.org/drawingml/2006/main">
+              <a:graphicData uri="http://schemas.openxmlformats.org/drawingml/2006/picture">
+                <pic:pic xmlns:pic="http://schemas.openxmlformats.org/drawingml/2006/picture">
+                  <pic:nvPicPr>
+                    <pic:cNvPr id="1239905405" name=""/>
+                    <pic:cNvPicPr/>
+                  </pic:nvPicPr>
+                  <pic:blipFill>
+                    <a:blip r:embed="rId15"/>
+                    <a:stretch>
+                      <a:fillRect/>
+                    </a:stretch>
+                  </pic:blipFill>
+                  <pic:spPr>
+                    <a:xfrm>
+                      <a:off x="0" y="0"/>
+                      <a:ext cx="3402218" cy="2687877"/>
+                    </a:xfrm>
+                    <a:prstGeom prst="rect">
+                      <a:avLst/>
+                    </a:prstGeom>
+                  </pic:spPr>
+                </pic:pic>
+              </a:graphicData>
+            </a:graphic>
+          </wp:inline>
+        </w:drawing>
+      </w:r>
+    </w:p>
+    <w:p>
+      <w:r>
+        <w:t>Truthy and Falsey values</w:t>
+      </w:r>
+      <w:r>
+        <w:t>: Everything in the image below is a falsy value and everything not on the list is a truthy value</w:t>
+      </w:r>
+    </w:p>
+    <w:p>
+      <w:r>
+        <w:drawing>
+          <wp:inline distT="0" distB="0" distL="0" distR="0" wp14:anchorId="77721C64" wp14:editId="0E2B8BF7">
+            <wp:extent cx="4056191" cy="1679171"/>
+            <wp:effectExtent l="0" t="0" r="1905" b="0"/>
+            <wp:docPr id="676188976" name="Picture 1"/>
+            <wp:cNvGraphicFramePr>
+              <a:graphicFrameLocks xmlns:a="http://schemas.openxmlformats.org/drawingml/2006/main" noChangeAspect="1"/>
+            </wp:cNvGraphicFramePr>
+            <a:graphic xmlns:a="http://schemas.openxmlformats.org/drawingml/2006/main">
+              <a:graphicData uri="http://schemas.openxmlformats.org/drawingml/2006/picture">
+                <pic:pic xmlns:pic="http://schemas.openxmlformats.org/drawingml/2006/picture">
+                  <pic:nvPicPr>
+                    <pic:cNvPr id="676188976" name=""/>
+                    <pic:cNvPicPr/>
+                  </pic:nvPicPr>
+                  <pic:blipFill>
+                    <a:blip r:embed="rId16"/>
+                    <a:stretch>
+                      <a:fillRect/>
+                    </a:stretch>
+                  </pic:blipFill>
+                  <pic:spPr>
+                    <a:xfrm>
+                      <a:off x="0" y="0"/>
+                      <a:ext cx="4067935" cy="1684033"/>
+                    </a:xfrm>
+                    <a:prstGeom prst="rect">
+                      <a:avLst/>
+                    </a:prstGeom>
+                  </pic:spPr>
+                </pic:pic>
+              </a:graphicData>
+            </a:graphic>
+          </wp:inline>
+        </w:drawing>
+      </w:r>
+    </w:p>
+    <w:p>
+      <w:r>
+        <w:lastRenderedPageBreak/>
+        <w:t>ShortCut to if statement</w:t>
+      </w:r>
+      <w:r>
+        <w:t xml:space="preserve">. Ternary operator, can be saved in a variable  </w:t>
+      </w:r>
+    </w:p>
+    <w:p>
+      <w:r>
+        <w:drawing>
+          <wp:inline distT="0" distB="0" distL="0" distR="0" wp14:anchorId="4D934791" wp14:editId="7A8AA7BE">
+            <wp:extent cx="2533650" cy="2402378"/>
+            <wp:effectExtent l="0" t="0" r="0" b="0"/>
+            <wp:docPr id="90954218" name="Picture 1"/>
+            <wp:cNvGraphicFramePr>
+              <a:graphicFrameLocks xmlns:a="http://schemas.openxmlformats.org/drawingml/2006/main" noChangeAspect="1"/>
+            </wp:cNvGraphicFramePr>
+            <a:graphic xmlns:a="http://schemas.openxmlformats.org/drawingml/2006/main">
+              <a:graphicData uri="http://schemas.openxmlformats.org/drawingml/2006/picture">
+                <pic:pic xmlns:pic="http://schemas.openxmlformats.org/drawingml/2006/picture">
+                  <pic:nvPicPr>
+                    <pic:cNvPr id="90954218" name=""/>
+                    <pic:cNvPicPr/>
+                  </pic:nvPicPr>
+                  <pic:blipFill>
+                    <a:blip r:embed="rId17"/>
+                    <a:stretch>
+                      <a:fillRect/>
+                    </a:stretch>
+                  </pic:blipFill>
+                  <pic:spPr>
+                    <a:xfrm>
+                      <a:off x="0" y="0"/>
+                      <a:ext cx="2537262" cy="2405803"/>
+                    </a:xfrm>
+                    <a:prstGeom prst="rect">
+                      <a:avLst/>
+                    </a:prstGeom>
+                  </pic:spPr>
+                </pic:pic>
+              </a:graphicData>
+            </a:graphic>
+          </wp:inline>
+        </w:drawing>
+      </w:r>
+      <w:r>
+        <w:t xml:space="preserve">           </w:t>
+      </w:r>
+      <w:r>
+        <w:drawing>
+          <wp:inline distT="0" distB="0" distL="0" distR="0" wp14:anchorId="4DB10053" wp14:editId="109F94FF">
+            <wp:extent cx="2260600" cy="1127466"/>
+            <wp:effectExtent l="0" t="0" r="6350" b="0"/>
+            <wp:docPr id="442780159" name="Picture 1"/>
+            <wp:cNvGraphicFramePr>
+              <a:graphicFrameLocks xmlns:a="http://schemas.openxmlformats.org/drawingml/2006/main" noChangeAspect="1"/>
+            </wp:cNvGraphicFramePr>
+            <a:graphic xmlns:a="http://schemas.openxmlformats.org/drawingml/2006/main">
+              <a:graphicData uri="http://schemas.openxmlformats.org/drawingml/2006/picture">
+                <pic:pic xmlns:pic="http://schemas.openxmlformats.org/drawingml/2006/picture">
+                  <pic:nvPicPr>
+                    <pic:cNvPr id="442780159" name=""/>
+                    <pic:cNvPicPr/>
+                  </pic:nvPicPr>
+                  <pic:blipFill>
+                    <a:blip r:embed="rId18"/>
+                    <a:stretch>
+                      <a:fillRect/>
+                    </a:stretch>
+                  </pic:blipFill>
+                  <pic:spPr>
+                    <a:xfrm>
+                      <a:off x="0" y="0"/>
+                      <a:ext cx="2301324" cy="1147777"/>
+                    </a:xfrm>
+                    <a:prstGeom prst="rect">
+                      <a:avLst/>
+                    </a:prstGeom>
+                  </pic:spPr>
+                </pic:pic>
+              </a:graphicData>
+            </a:graphic>
+          </wp:inline>
+        </w:drawing>
+      </w:r>
+    </w:p>
+    <w:p/>
+    <w:p>
+      <w:r>
+        <w:t xml:space="preserve">Can be used so options don’t short circuit if a clear option is not chosen: the OR operator that is; e.g const currency = ‘EURO’ || ‘USD’ </w:t>
+      </w:r>
+    </w:p>
+    <w:p>
+      <w:r>
+        <w:t>If a clear option isn’t entered e.g const currency = undefined || ‘USD’ then the latter is taken and stored in the ‘currency’ variable instead.</w:t>
+      </w:r>
+    </w:p>
+    <w:p>
+      <w:r>
+        <w:drawing>
+          <wp:inline distT="0" distB="0" distL="0" distR="0" wp14:anchorId="32E66356" wp14:editId="4B7D9955">
+            <wp:extent cx="4648849" cy="2676899"/>
+            <wp:effectExtent l="0" t="0" r="0" b="9525"/>
+            <wp:docPr id="751002887" name="Picture 1"/>
+            <wp:cNvGraphicFramePr>
+              <a:graphicFrameLocks xmlns:a="http://schemas.openxmlformats.org/drawingml/2006/main" noChangeAspect="1"/>
+            </wp:cNvGraphicFramePr>
+            <a:graphic xmlns:a="http://schemas.openxmlformats.org/drawingml/2006/main">
+              <a:graphicData uri="http://schemas.openxmlformats.org/drawingml/2006/picture">
+                <pic:pic xmlns:pic="http://schemas.openxmlformats.org/drawingml/2006/picture">
+                  <pic:nvPicPr>
+                    <pic:cNvPr id="751002887" name=""/>
+                    <pic:cNvPicPr/>
+                  </pic:nvPicPr>
+                  <pic:blipFill>
+                    <a:blip r:embed="rId19"/>
+                    <a:stretch>
+                      <a:fillRect/>
+                    </a:stretch>
+                  </pic:blipFill>
+                  <pic:spPr>
+                    <a:xfrm>
+                      <a:off x="0" y="0"/>
+                      <a:ext cx="4648849" cy="2676899"/>
+                    </a:xfrm>
+                    <a:prstGeom prst="rect">
+                      <a:avLst/>
+                    </a:prstGeom>
+                  </pic:spPr>
+                </pic:pic>
+              </a:graphicData>
+            </a:graphic>
+          </wp:inline>
+        </w:drawing>
+      </w:r>
+    </w:p>
+    <w:p/>
+    <w:p>
+      <w:r>
+        <w:t>Objects: we’ve learnt about localStorage, JSON and others</w:t>
+      </w:r>
+    </w:p>
+    <w:p>
+      <w:r>
+        <w:t>JSON.stringify(var) – converts variable into string and stores in another var</w:t>
+      </w:r>
+    </w:p>
+    <w:p>
+      <w:r>
+        <w:t>JSON.parse(var2) – takes the stored string and converts it back to code</w:t>
+      </w:r>
+    </w:p>
+    <w:p>
+      <w:r>
+        <w:lastRenderedPageBreak/>
+        <w:t>localStorage.setItem(‘item name’, ‘item as string’) – it stores the items as strings so in a case where the item is an object or expression or number or sumn we’lll have to use JSON.stringify(item/var) to convert the variable into a string and store in localStorage i.e</w:t>
+      </w:r>
+    </w:p>
+    <w:p>
+      <w:r>
+        <w:t>const var1 = {name: ‘arthur’, age: 19, height: “ 5’6 “}</w:t>
+      </w:r>
+    </w:p>
+    <w:p>
+      <w:r>
+        <w:t>localStorage.setItem(‘var 1’, JSON.stringify(var1))</w:t>
+      </w:r>
+    </w:p>
+    <w:p>
+      <w:r>
+        <w:t>localStorage.setItem(‘item name’) – is used to get the item back as a string that it was stored, but as this string it can’t be manipulated as code, so as we learnt above we use JSON.parse to convert it back to code i.e</w:t>
+      </w:r>
+    </w:p>
+    <w:p>
+      <w:r>
+        <w:t>let newvar = JSON.parse(localStorage.getItem(‘var1’))</w:t>
+      </w:r>
+    </w:p>
+    <w:p>
+      <w:r>
+        <w:t>localStorage.removeItem(‘item name’) – can be used to delete an item from localStorage</w:t>
+      </w:r>
+    </w:p>
+    <w:p/>
+    <w:p>
+      <w:r>
+        <w:t>null vs undefined</w:t>
+      </w:r>
+    </w:p>
+    <w:p>
+      <w:r>
+        <w:t>null is used intentionally set a variable to empty or check if it’s empty, while undefined is for a value which hasn’t been initialized but can still use a default value if one was set</w:t>
+      </w:r>
+    </w:p>
+    <w:p>
+      <w:r>
+        <w:rPr>
+          <w:noProof/>
+        </w:rPr>
+        <w:drawing>
+          <wp:inline distT="0" distB="0" distL="0" distR="0" wp14:anchorId="52D7EF4C" wp14:editId="27C6BA69">
+            <wp:extent cx="5968365" cy="3591098"/>
+            <wp:effectExtent l="0" t="0" r="0" b="9525"/>
+            <wp:docPr id="595530080" name="Picture 7"/>
+            <wp:cNvGraphicFramePr>
+              <a:graphicFrameLocks xmlns:a="http://schemas.openxmlformats.org/drawingml/2006/main" noChangeAspect="1"/>
+            </wp:cNvGraphicFramePr>
+            <a:graphic xmlns:a="http://schemas.openxmlformats.org/drawingml/2006/main">
+              <a:graphicData uri="http://schemas.openxmlformats.org/drawingml/2006/picture">
+                <pic:pic xmlns:pic="http://schemas.openxmlformats.org/drawingml/2006/picture">
+                  <pic:nvPicPr>
+                    <pic:cNvPr id="0" name="Picture 13"/>
+                    <pic:cNvPicPr>
+                      <a:picLocks noChangeAspect="1" noChangeArrowheads="1"/>
+                    </pic:cNvPicPr>
+                  </pic:nvPicPr>
+                  <pic:blipFill>
+                    <a:blip r:embed="rId20">
+                      <a:extLst>
+                        <a:ext uri="{28A0092B-C50C-407E-A947-70E740481C1C}">
+                          <a14:useLocalDpi xmlns:a14="http://schemas.microsoft.com/office/drawing/2010/main" val="0"/>
+                        </a:ext>
+                      </a:extLst>
+                    </a:blip>
+                    <a:srcRect/>
+                    <a:stretch>
+                      <a:fillRect/>
+                    </a:stretch>
+                  </pic:blipFill>
+                  <pic:spPr bwMode="auto">
+                    <a:xfrm>
+                      <a:off x="0" y="0"/>
+                      <a:ext cx="5987510" cy="3602618"/>
+                    </a:xfrm>
+                    <a:prstGeom prst="rect">
+                      <a:avLst/>
+                    </a:prstGeom>
+                    <a:noFill/>
+                    <a:ln>
+                      <a:noFill/>
+                    </a:ln>
+                  </pic:spPr>
+                </pic:pic>
+              </a:graphicData>
+            </a:graphic>
+          </wp:inline>
+        </w:drawing>
+      </w:r>
+      <w:r>
+        <w:t xml:space="preserve"> </w:t>
+      </w:r>
+    </w:p>
+    <w:p>
+      <w:r>
+        <w:t>Document Object Model</w:t>
+      </w:r>
+    </w:p>
+    <w:p>
+      <w:r>
+        <w:drawing>
+          <wp:inline distT="0" distB="0" distL="0" distR="0" wp14:anchorId="3B1C8139" wp14:editId="4F963867">
+            <wp:extent cx="2010056" cy="695422"/>
+            <wp:effectExtent l="0" t="0" r="9525" b="9525"/>
+            <wp:docPr id="1202936216" name="Picture 1"/>
+            <wp:cNvGraphicFramePr>
+              <a:graphicFrameLocks xmlns:a="http://schemas.openxmlformats.org/drawingml/2006/main" noChangeAspect="1"/>
+            </wp:cNvGraphicFramePr>
+            <a:graphic xmlns:a="http://schemas.openxmlformats.org/drawingml/2006/main">
+              <a:graphicData uri="http://schemas.openxmlformats.org/drawingml/2006/picture">
+                <pic:pic xmlns:pic="http://schemas.openxmlformats.org/drawingml/2006/picture">
+                  <pic:nvPicPr>
+                    <pic:cNvPr id="1202936216" name=""/>
+                    <pic:cNvPicPr/>
+                  </pic:nvPicPr>
+                  <pic:blipFill>
+                    <a:blip r:embed="rId21"/>
+                    <a:stretch>
+                      <a:fillRect/>
+                    </a:stretch>
+                  </pic:blipFill>
+                  <pic:spPr>
+                    <a:xfrm>
+                      <a:off x="0" y="0"/>
+                      <a:ext cx="2010056" cy="695422"/>
+                    </a:xfrm>
+                    <a:prstGeom prst="rect">
+                      <a:avLst/>
+                    </a:prstGeom>
                   </pic:spPr>
                 </pic:pic>
               </a:graphicData>

</xml_diff>

<commit_message>
End of lesson 9
</commit_message>
<xml_diff>
--- a/Javascript learning process - Documentation.docx
+++ b/Javascript learning process - Documentation.docx
@@ -9,6 +9,9 @@
     </w:p>
     <w:p>
       <w:r>
+        <w:rPr>
+          <w:noProof/>
+        </w:rPr>
         <w:drawing>
           <wp:inline distT="0" distB="0" distL="0" distR="0" wp14:anchorId="16DCFBEF" wp14:editId="7269D4DB">
             <wp:extent cx="3171825" cy="2344189"/>
@@ -279,6 +282,9 @@
     </w:p>
     <w:p>
       <w:r>
+        <w:rPr>
+          <w:noProof/>
+        </w:rPr>
         <w:drawing>
           <wp:inline distT="0" distB="0" distL="0" distR="0" wp14:anchorId="71BC1FC9" wp14:editId="0429AC24">
             <wp:extent cx="2513485" cy="2044931"/>
@@ -381,6 +387,9 @@
     </w:p>
     <w:p>
       <w:r>
+        <w:rPr>
+          <w:noProof/>
+        </w:rPr>
         <w:drawing>
           <wp:inline distT="0" distB="0" distL="0" distR="0" wp14:anchorId="002B686B" wp14:editId="2E794651">
             <wp:extent cx="5731510" cy="3626485"/>
@@ -421,6 +430,9 @@
     <w:p/>
     <w:p>
       <w:r>
+        <w:rPr>
+          <w:noProof/>
+        </w:rPr>
         <w:lastRenderedPageBreak/>
         <w:drawing>
           <wp:inline distT="0" distB="0" distL="0" distR="0" wp14:anchorId="3E5D8EF8" wp14:editId="264285C7">
@@ -528,6 +540,9 @@
     <w:p/>
     <w:p>
       <w:r>
+        <w:rPr>
+          <w:noProof/>
+        </w:rPr>
         <w:drawing>
           <wp:inline distT="0" distB="0" distL="0" distR="0" wp14:anchorId="60D91176" wp14:editId="0C0178BD">
             <wp:extent cx="2127556" cy="2686973"/>
@@ -568,6 +583,9 @@
         <w:t xml:space="preserve">   </w:t>
       </w:r>
       <w:r>
+        <w:rPr>
+          <w:noProof/>
+        </w:rPr>
         <w:drawing>
           <wp:inline distT="0" distB="0" distL="0" distR="0" wp14:anchorId="4FB55F16" wp14:editId="312920CB">
             <wp:extent cx="3399905" cy="2686050"/>
@@ -615,6 +633,9 @@
     </w:p>
     <w:p>
       <w:r>
+        <w:rPr>
+          <w:noProof/>
+        </w:rPr>
         <w:drawing>
           <wp:inline distT="0" distB="0" distL="0" distR="0" wp14:anchorId="77721C64" wp14:editId="0E2B8BF7">
             <wp:extent cx="4056191" cy="1679171"/>
@@ -663,6 +684,9 @@
     </w:p>
     <w:p>
       <w:r>
+        <w:rPr>
+          <w:noProof/>
+        </w:rPr>
         <w:drawing>
           <wp:inline distT="0" distB="0" distL="0" distR="0" wp14:anchorId="4D934791" wp14:editId="7A8AA7BE">
             <wp:extent cx="2533650" cy="2402378"/>
@@ -703,6 +727,9 @@
         <w:t xml:space="preserve">           </w:t>
       </w:r>
       <w:r>
+        <w:rPr>
+          <w:noProof/>
+        </w:rPr>
         <w:drawing>
           <wp:inline distT="0" distB="0" distL="0" distR="0" wp14:anchorId="4DB10053" wp14:editId="109F94FF">
             <wp:extent cx="2260600" cy="1127466"/>
@@ -753,6 +780,9 @@
     </w:p>
     <w:p>
       <w:r>
+        <w:rPr>
+          <w:noProof/>
+        </w:rPr>
         <w:drawing>
           <wp:inline distT="0" distB="0" distL="0" distR="0" wp14:anchorId="32E66356" wp14:editId="4B7D9955">
             <wp:extent cx="4648849" cy="2676899"/>
@@ -913,6 +943,9 @@
     </w:p>
     <w:p>
       <w:r>
+        <w:rPr>
+          <w:noProof/>
+        </w:rPr>
         <w:drawing>
           <wp:inline distT="0" distB="0" distL="0" distR="0" wp14:anchorId="3B1C8139" wp14:editId="4F963867">
             <wp:extent cx="2010056" cy="695422"/>
@@ -938,6 +971,111 @@
                     <a:xfrm>
                       <a:off x="0" y="0"/>
                       <a:ext cx="2010056" cy="695422"/>
+                    </a:xfrm>
+                    <a:prstGeom prst="rect">
+                      <a:avLst/>
+                    </a:prstGeom>
+                  </pic:spPr>
+                </pic:pic>
+              </a:graphicData>
+            </a:graphic>
+          </wp:inline>
+        </w:drawing>
+      </w:r>
+    </w:p>
+    <w:p>
+      <w:pPr>
+        <w:rPr>
+          <w:sz w:val="36"/>
+          <w:szCs w:val="36"/>
+        </w:rPr>
+      </w:pPr>
+      <w:r>
+        <w:rPr>
+          <w:sz w:val="36"/>
+          <w:szCs w:val="36"/>
+        </w:rPr>
+        <w:lastRenderedPageBreak/>
+        <w:t>Events and Event Listeners</w:t>
+      </w:r>
+    </w:p>
+    <w:p>
+      <w:r>
+        <w:t>Events are actions performed by a client such as click and keydowns while event listeners are things like onclick and onkeydowns which perform a js function based on what event occurred and what function is called. Others include:</w:t>
+      </w:r>
+    </w:p>
+    <w:p>
+      <w:r>
+        <w:drawing>
+          <wp:inline distT="0" distB="0" distL="0" distR="0" wp14:anchorId="3808D8C2" wp14:editId="46705B19">
+            <wp:extent cx="3391373" cy="2133898"/>
+            <wp:effectExtent l="0" t="0" r="0" b="0"/>
+            <wp:docPr id="1053077040" name="Picture 1"/>
+            <wp:cNvGraphicFramePr>
+              <a:graphicFrameLocks xmlns:a="http://schemas.openxmlformats.org/drawingml/2006/main" noChangeAspect="1"/>
+            </wp:cNvGraphicFramePr>
+            <a:graphic xmlns:a="http://schemas.openxmlformats.org/drawingml/2006/main">
+              <a:graphicData uri="http://schemas.openxmlformats.org/drawingml/2006/picture">
+                <pic:pic xmlns:pic="http://schemas.openxmlformats.org/drawingml/2006/picture">
+                  <pic:nvPicPr>
+                    <pic:cNvPr id="1053077040" name=""/>
+                    <pic:cNvPicPr/>
+                  </pic:nvPicPr>
+                  <pic:blipFill>
+                    <a:blip r:embed="rId22"/>
+                    <a:stretch>
+                      <a:fillRect/>
+                    </a:stretch>
+                  </pic:blipFill>
+                  <pic:spPr>
+                    <a:xfrm>
+                      <a:off x="0" y="0"/>
+                      <a:ext cx="3391373" cy="2133898"/>
+                    </a:xfrm>
+                    <a:prstGeom prst="rect">
+                      <a:avLst/>
+                    </a:prstGeom>
+                  </pic:spPr>
+                </pic:pic>
+              </a:graphicData>
+            </a:graphic>
+          </wp:inline>
+        </w:drawing>
+      </w:r>
+    </w:p>
+    <w:p/>
+    <w:p>
+      <w:r>
+        <w:t>Subtracting number from string gives a difference; number, but adding number to string gives a sum; string. Complex stuff I know</w:t>
+      </w:r>
+    </w:p>
+    <w:p>
+      <w:r>
+        <w:drawing>
+          <wp:inline distT="0" distB="0" distL="0" distR="0" wp14:anchorId="478795E0" wp14:editId="378D8F96">
+            <wp:extent cx="4848902" cy="2743583"/>
+            <wp:effectExtent l="0" t="0" r="8890" b="0"/>
+            <wp:docPr id="73149473" name="Picture 1"/>
+            <wp:cNvGraphicFramePr>
+              <a:graphicFrameLocks xmlns:a="http://schemas.openxmlformats.org/drawingml/2006/main" noChangeAspect="1"/>
+            </wp:cNvGraphicFramePr>
+            <a:graphic xmlns:a="http://schemas.openxmlformats.org/drawingml/2006/main">
+              <a:graphicData uri="http://schemas.openxmlformats.org/drawingml/2006/picture">
+                <pic:pic xmlns:pic="http://schemas.openxmlformats.org/drawingml/2006/picture">
+                  <pic:nvPicPr>
+                    <pic:cNvPr id="73149473" name=""/>
+                    <pic:cNvPicPr/>
+                  </pic:nvPicPr>
+                  <pic:blipFill>
+                    <a:blip r:embed="rId23"/>
+                    <a:stretch>
+                      <a:fillRect/>
+                    </a:stretch>
+                  </pic:blipFill>
+                  <pic:spPr>
+                    <a:xfrm>
+                      <a:off x="0" y="0"/>
+                      <a:ext cx="4848902" cy="2743583"/>
                     </a:xfrm>
                     <a:prstGeom prst="rect">
                       <a:avLst/>

</xml_diff>

<commit_message>
Updates to exercises: Calculator
</commit_message>
<xml_diff>
--- a/Javascript learning process - Documentation.docx
+++ b/Javascript learning process - Documentation.docx
@@ -3,8 +3,13 @@
 <w:document xmlns:wpc="http://schemas.microsoft.com/office/word/2010/wordprocessingCanvas" xmlns:cx="http://schemas.microsoft.com/office/drawing/2014/chartex" xmlns:cx1="http://schemas.microsoft.com/office/drawing/2015/9/8/chartex" xmlns:cx2="http://schemas.microsoft.com/office/drawing/2015/10/21/chartex" xmlns:cx3="http://schemas.microsoft.com/office/drawing/2016/5/9/chartex" xmlns:cx4="http://schemas.microsoft.com/office/drawing/2016/5/10/chartex" xmlns:cx5="http://schemas.microsoft.com/office/drawing/2016/5/11/chartex" xmlns:cx6="http://schemas.microsoft.com/office/drawing/2016/5/12/chartex" xmlns:cx7="http://schemas.microsoft.com/office/drawing/2016/5/13/chartex" xmlns:cx8="http://schemas.microsoft.com/office/drawing/2016/5/14/chartex" xmlns:mc="http://schemas.openxmlformats.org/markup-compatibility/2006" xmlns:aink="http://schemas.microsoft.com/office/drawing/2016/ink" xmlns:am3d="http://schemas.microsoft.com/office/drawing/2017/model3d" xmlns:o="urn:schemas-microsoft-com:office:office" xmlns:oel="http://schemas.microsoft.com/office/2019/extlst" xmlns:r="http://schemas.openxmlformats.org/officeDocument/2006/relationships" xmlns:m="http://schemas.openxmlformats.org/officeDocument/2006/math" xmlns:v="urn:schemas-microsoft-com:vml" xmlns:wp14="http://schemas.microsoft.com/office/word/2010/wordprocessingDrawing" xmlns:wp="http://schemas.openxmlformats.org/drawingml/2006/wordprocessingDrawing" xmlns:w10="urn:schemas-microsoft-com:office:word" xmlns:w="http://schemas.openxmlformats.org/wordprocessingml/2006/main" xmlns:w14="http://schemas.microsoft.com/office/word/2010/wordml" xmlns:w15="http://schemas.microsoft.com/office/word/2012/wordml" xmlns:w16cex="http://schemas.microsoft.com/office/word/2018/wordml/cex" xmlns:w16cid="http://schemas.microsoft.com/office/word/2016/wordml/cid" xmlns:w16="http://schemas.microsoft.com/office/word/2018/wordml" xmlns:w16du="http://schemas.microsoft.com/office/word/2023/wordml/word16du" xmlns:w16sdtdh="http://schemas.microsoft.com/office/word/2020/wordml/sdtdatahash" xmlns:w16sdtfl="http://schemas.microsoft.com/office/word/2024/wordml/sdtformatlock" xmlns:w16se="http://schemas.microsoft.com/office/word/2015/wordml/symex" xmlns:wpg="http://schemas.microsoft.com/office/word/2010/wordprocessingGroup" xmlns:wpi="http://schemas.microsoft.com/office/word/2010/wordprocessingInk" xmlns:wne="http://schemas.microsoft.com/office/word/2006/wordml" xmlns:wps="http://schemas.microsoft.com/office/word/2010/wordprocessingShape" mc:Ignorable="w14 w15 w16se w16cid w16 w16cex w16sdtdh w16sdtfl w16du wp14">
   <w:body>
     <w:p>
-      <w:r>
-        <w:t>Javascript learning process</w:t>
+      <w:proofErr w:type="spellStart"/>
+      <w:r>
+        <w:t>Javascript</w:t>
+      </w:r>
+      <w:proofErr w:type="spellEnd"/>
+      <w:r>
+        <w:t xml:space="preserve"> learning process</w:t>
       </w:r>
     </w:p>
     <w:p>
@@ -271,13 +276,34 @@
       </w:r>
     </w:p>
     <w:p>
-      <w:r>
-        <w:t>e.g: console.log(“I’m named ” + string + “I’m “ + var1);</w:t>
-      </w:r>
-    </w:p>
-    <w:p>
-      <w:r>
-        <w:t>with back ticks use ( ` string: ${ } ` )</w:t>
+      <w:proofErr w:type="spellStart"/>
+      <w:r>
+        <w:t>e.g</w:t>
+      </w:r>
+      <w:proofErr w:type="spellEnd"/>
+      <w:r>
+        <w:t xml:space="preserve">: </w:t>
+      </w:r>
+      <w:proofErr w:type="gramStart"/>
+      <w:r>
+        <w:t>console.log(</w:t>
+      </w:r>
+      <w:proofErr w:type="gramEnd"/>
+      <w:r>
+        <w:t>“I’m named ” + string + “I’m “ + var1);</w:t>
+      </w:r>
+    </w:p>
+    <w:p>
+      <w:r>
+        <w:t xml:space="preserve">with back ticks use </w:t>
+      </w:r>
+      <w:proofErr w:type="gramStart"/>
+      <w:r>
+        <w:t>( `</w:t>
+      </w:r>
+      <w:proofErr w:type="gramEnd"/>
+      <w:r>
+        <w:t xml:space="preserve"> string: ${ } ` )</w:t>
       </w:r>
     </w:p>
     <w:p>
@@ -628,7 +654,15 @@
         <w:t>Truthy and Falsey values</w:t>
       </w:r>
       <w:r>
-        <w:t>: Everything in the image below is a falsy value and everything not on the list is a truthy value</w:t>
+        <w:t xml:space="preserve">: Everything in the image below is a </w:t>
+      </w:r>
+      <w:proofErr w:type="spellStart"/>
+      <w:r>
+        <w:t>falsy</w:t>
+      </w:r>
+      <w:proofErr w:type="spellEnd"/>
+      <w:r>
+        <w:t xml:space="preserve"> value and everything not on the list is a truthy value</w:t>
       </w:r>
     </w:p>
     <w:p>
@@ -674,9 +708,14 @@
       </w:r>
     </w:p>
     <w:p>
+      <w:proofErr w:type="spellStart"/>
       <w:r>
         <w:lastRenderedPageBreak/>
-        <w:t>ShortCut to if statement</w:t>
+        <w:t>ShortCut</w:t>
+      </w:r>
+      <w:proofErr w:type="spellEnd"/>
+      <w:r>
+        <w:t xml:space="preserve"> to if statement</w:t>
       </w:r>
       <w:r>
         <w:t xml:space="preserve">. Ternary operator, can be saved in a variable  </w:t>
@@ -770,12 +809,28 @@
     <w:p/>
     <w:p>
       <w:r>
-        <w:t xml:space="preserve">Can be used so options don’t short circuit if a clear option is not chosen: the OR operator that is; e.g const currency = ‘EURO’ || ‘USD’ </w:t>
-      </w:r>
-    </w:p>
-    <w:p>
-      <w:r>
-        <w:t>If a clear option isn’t entered e.g const currency = undefined || ‘USD’ then the latter is taken and stored in the ‘currency’ variable instead.</w:t>
+        <w:t xml:space="preserve">Can be used so options don’t short circuit if a clear option is not chosen: the OR operator that is; </w:t>
+      </w:r>
+      <w:proofErr w:type="spellStart"/>
+      <w:r>
+        <w:t>e.g</w:t>
+      </w:r>
+      <w:proofErr w:type="spellEnd"/>
+      <w:r>
+        <w:t xml:space="preserve"> const currency = ‘EURO’ || ‘USD’ </w:t>
+      </w:r>
+    </w:p>
+    <w:p>
+      <w:r>
+        <w:t xml:space="preserve">If a clear option isn’t entered </w:t>
+      </w:r>
+      <w:proofErr w:type="spellStart"/>
+      <w:r>
+        <w:t>e.g</w:t>
+      </w:r>
+      <w:proofErr w:type="spellEnd"/>
+      <w:r>
+        <w:t xml:space="preserve"> const currency = undefined || ‘USD’ then the latter is taken and stored in the ‘currency’ variable instead.</w:t>
       </w:r>
     </w:p>
     <w:p>
@@ -823,49 +878,198 @@
     <w:p/>
     <w:p>
       <w:r>
-        <w:t>Objects: we’ve learnt about localStorage, JSON and others</w:t>
-      </w:r>
-    </w:p>
-    <w:p>
-      <w:r>
-        <w:t>JSON.stringify(var) – converts variable into string and stores in another var</w:t>
-      </w:r>
-    </w:p>
-    <w:p>
-      <w:r>
-        <w:t>JSON.parse(var2) – takes the stored string and converts it back to code</w:t>
-      </w:r>
-    </w:p>
-    <w:p>
+        <w:t xml:space="preserve">Objects: we’ve learnt about </w:t>
+      </w:r>
+      <w:proofErr w:type="spellStart"/>
+      <w:r>
+        <w:t>localStorage</w:t>
+      </w:r>
+      <w:proofErr w:type="spellEnd"/>
+      <w:r>
+        <w:t>, JSON and others</w:t>
+      </w:r>
+    </w:p>
+    <w:p>
+      <w:proofErr w:type="spellStart"/>
+      <w:r>
+        <w:t>JSON.stringify</w:t>
+      </w:r>
+      <w:proofErr w:type="spellEnd"/>
+      <w:r>
+        <w:t>(var) – converts variable into string and stores in another var</w:t>
+      </w:r>
+    </w:p>
+    <w:p>
+      <w:proofErr w:type="spellStart"/>
+      <w:r>
+        <w:t>JSON.parse</w:t>
+      </w:r>
+      <w:proofErr w:type="spellEnd"/>
+      <w:r>
+        <w:t>(var2) – takes the stored string and converts it back to code</w:t>
+      </w:r>
+    </w:p>
+    <w:p>
+      <w:proofErr w:type="spellStart"/>
       <w:r>
         <w:lastRenderedPageBreak/>
-        <w:t>localStorage.setItem(‘item name’, ‘item as string’) – it stores the items as strings so in a case where the item is an object or expression or number or sumn we’lll have to use JSON.stringify(item/var) to convert the variable into a string and store in localStorage i.e</w:t>
-      </w:r>
-    </w:p>
-    <w:p>
-      <w:r>
-        <w:t>const var1 = {name: ‘arthur’, age: 19, height: “ 5’6 “}</w:t>
-      </w:r>
-    </w:p>
-    <w:p>
-      <w:r>
-        <w:t>localStorage.setItem(‘var 1’, JSON.stringify(var1))</w:t>
-      </w:r>
-    </w:p>
-    <w:p>
-      <w:r>
-        <w:t>localStorage.setItem(‘item name’) – is used to get the item back as a string that it was stored, but as this string it can’t be manipulated as code, so as we learnt above we use JSON.parse to convert it back to code i.e</w:t>
-      </w:r>
-    </w:p>
-    <w:p>
-      <w:r>
-        <w:t>let newvar = JSON.parse(localStorage.getItem(‘var1’))</w:t>
-      </w:r>
-    </w:p>
-    <w:p>
-      <w:r>
-        <w:t>localStorage.removeItem(‘item name’) – can be used to delete an item from localStorage</w:t>
-      </w:r>
+        <w:t>localStorage.setItem</w:t>
+      </w:r>
+      <w:proofErr w:type="spellEnd"/>
+      <w:r>
+        <w:t xml:space="preserve">(‘item name’, ‘item as string’) – it stores the items as strings so in a case where the item is an object or expression or number or </w:t>
+      </w:r>
+      <w:proofErr w:type="spellStart"/>
+      <w:r>
+        <w:t>sumn</w:t>
+      </w:r>
+      <w:proofErr w:type="spellEnd"/>
+      <w:r>
+        <w:t xml:space="preserve"> </w:t>
+      </w:r>
+      <w:proofErr w:type="spellStart"/>
+      <w:r>
+        <w:t>we’lll</w:t>
+      </w:r>
+      <w:proofErr w:type="spellEnd"/>
+      <w:r>
+        <w:t xml:space="preserve"> have to use </w:t>
+      </w:r>
+      <w:proofErr w:type="spellStart"/>
+      <w:r>
+        <w:t>JSON.stringify</w:t>
+      </w:r>
+      <w:proofErr w:type="spellEnd"/>
+      <w:r>
+        <w:t xml:space="preserve">(item/var) to convert the variable into a string and store in </w:t>
+      </w:r>
+      <w:proofErr w:type="spellStart"/>
+      <w:r>
+        <w:t>localStorage</w:t>
+      </w:r>
+      <w:proofErr w:type="spellEnd"/>
+      <w:r>
+        <w:t xml:space="preserve"> </w:t>
+      </w:r>
+      <w:proofErr w:type="spellStart"/>
+      <w:r>
+        <w:t>i.e</w:t>
+      </w:r>
+      <w:proofErr w:type="spellEnd"/>
+    </w:p>
+    <w:p>
+      <w:r>
+        <w:t>const var1 = {name: ‘</w:t>
+      </w:r>
+      <w:proofErr w:type="spellStart"/>
+      <w:r>
+        <w:t>arthur</w:t>
+      </w:r>
+      <w:proofErr w:type="spellEnd"/>
+      <w:r>
+        <w:t xml:space="preserve">’, age: 19, height: </w:t>
+      </w:r>
+      <w:proofErr w:type="gramStart"/>
+      <w:r>
+        <w:t>“ 5</w:t>
+      </w:r>
+      <w:proofErr w:type="gramEnd"/>
+      <w:r>
+        <w:t>’6 “}</w:t>
+      </w:r>
+    </w:p>
+    <w:p>
+      <w:proofErr w:type="spellStart"/>
+      <w:r>
+        <w:t>localStorage.setItem</w:t>
+      </w:r>
+      <w:proofErr w:type="spellEnd"/>
+      <w:r>
+        <w:t xml:space="preserve">(‘var 1’, </w:t>
+      </w:r>
+      <w:proofErr w:type="spellStart"/>
+      <w:r>
+        <w:t>JSON.stringify</w:t>
+      </w:r>
+      <w:proofErr w:type="spellEnd"/>
+      <w:r>
+        <w:t>(var1))</w:t>
+      </w:r>
+    </w:p>
+    <w:p>
+      <w:proofErr w:type="spellStart"/>
+      <w:r>
+        <w:t>localStorage.setItem</w:t>
+      </w:r>
+      <w:proofErr w:type="spellEnd"/>
+      <w:r>
+        <w:t xml:space="preserve">(‘item name’) – is used to get the item back as a string that it was stored, but as this string it can’t be manipulated as code, so as we learnt </w:t>
+      </w:r>
+      <w:proofErr w:type="gramStart"/>
+      <w:r>
+        <w:t>above</w:t>
+      </w:r>
+      <w:proofErr w:type="gramEnd"/>
+      <w:r>
+        <w:t xml:space="preserve"> we use </w:t>
+      </w:r>
+      <w:proofErr w:type="spellStart"/>
+      <w:r>
+        <w:t>JSON.parse</w:t>
+      </w:r>
+      <w:proofErr w:type="spellEnd"/>
+      <w:r>
+        <w:t xml:space="preserve"> to convert it back to code </w:t>
+      </w:r>
+      <w:proofErr w:type="spellStart"/>
+      <w:r>
+        <w:t>i.e</w:t>
+      </w:r>
+      <w:proofErr w:type="spellEnd"/>
+    </w:p>
+    <w:p>
+      <w:r>
+        <w:t xml:space="preserve">let </w:t>
+      </w:r>
+      <w:proofErr w:type="spellStart"/>
+      <w:r>
+        <w:t>newvar</w:t>
+      </w:r>
+      <w:proofErr w:type="spellEnd"/>
+      <w:r>
+        <w:t xml:space="preserve"> = </w:t>
+      </w:r>
+      <w:proofErr w:type="spellStart"/>
+      <w:r>
+        <w:t>JSON.parse</w:t>
+      </w:r>
+      <w:proofErr w:type="spellEnd"/>
+      <w:r>
+        <w:t>(</w:t>
+      </w:r>
+      <w:proofErr w:type="spellStart"/>
+      <w:r>
+        <w:t>localStorage.getItem</w:t>
+      </w:r>
+      <w:proofErr w:type="spellEnd"/>
+      <w:r>
+        <w:t>(‘var1’))</w:t>
+      </w:r>
+    </w:p>
+    <w:p>
+      <w:proofErr w:type="spellStart"/>
+      <w:r>
+        <w:t>localStorage.removeItem</w:t>
+      </w:r>
+      <w:proofErr w:type="spellEnd"/>
+      <w:r>
+        <w:t xml:space="preserve">(‘item name’) – can be used to delete an item from </w:t>
+      </w:r>
+      <w:proofErr w:type="spellStart"/>
+      <w:r>
+        <w:t>localStorage</w:t>
+      </w:r>
+      <w:proofErr w:type="spellEnd"/>
     </w:p>
     <w:p/>
     <w:p>
@@ -1001,7 +1205,31 @@
     </w:p>
     <w:p>
       <w:r>
-        <w:t>Events are actions performed by a client such as click and keydowns while event listeners are things like onclick and onkeydowns which perform a js function based on what event occurred and what function is called. Others include:</w:t>
+        <w:t xml:space="preserve">Events are actions performed by a client such as click and </w:t>
+      </w:r>
+      <w:proofErr w:type="spellStart"/>
+      <w:r>
+        <w:t>keydowns</w:t>
+      </w:r>
+      <w:proofErr w:type="spellEnd"/>
+      <w:r>
+        <w:t xml:space="preserve"> while event listeners are things like onclick and </w:t>
+      </w:r>
+      <w:proofErr w:type="spellStart"/>
+      <w:r>
+        <w:t>onkeydowns</w:t>
+      </w:r>
+      <w:proofErr w:type="spellEnd"/>
+      <w:r>
+        <w:t xml:space="preserve"> which perform a </w:t>
+      </w:r>
+      <w:proofErr w:type="spellStart"/>
+      <w:r>
+        <w:t>js</w:t>
+      </w:r>
+      <w:proofErr w:type="spellEnd"/>
+      <w:r>
+        <w:t xml:space="preserve"> function based on what event occurred and what function is called. Others include:</w:t>
       </w:r>
     </w:p>
     <w:p>
@@ -1076,6 +1304,51 @@
                     <a:xfrm>
                       <a:off x="0" y="0"/>
                       <a:ext cx="4848902" cy="2743583"/>
+                    </a:xfrm>
+                    <a:prstGeom prst="rect">
+                      <a:avLst/>
+                    </a:prstGeom>
+                  </pic:spPr>
+                </pic:pic>
+              </a:graphicData>
+            </a:graphic>
+          </wp:inline>
+        </w:drawing>
+      </w:r>
+    </w:p>
+    <w:p/>
+    <w:p>
+      <w:r>
+        <w:t>Lesson 9 completed</w:t>
+      </w:r>
+    </w:p>
+    <w:p>
+      <w:r>
+        <w:drawing>
+          <wp:inline distT="0" distB="0" distL="0" distR="0" wp14:anchorId="3A18D819" wp14:editId="0FEAF366">
+            <wp:extent cx="2443942" cy="1055370"/>
+            <wp:effectExtent l="0" t="0" r="0" b="0"/>
+            <wp:docPr id="2095629191" name="Picture 1"/>
+            <wp:cNvGraphicFramePr>
+              <a:graphicFrameLocks xmlns:a="http://schemas.openxmlformats.org/drawingml/2006/main" noChangeAspect="1"/>
+            </wp:cNvGraphicFramePr>
+            <a:graphic xmlns:a="http://schemas.openxmlformats.org/drawingml/2006/main">
+              <a:graphicData uri="http://schemas.openxmlformats.org/drawingml/2006/picture">
+                <pic:pic xmlns:pic="http://schemas.openxmlformats.org/drawingml/2006/picture">
+                  <pic:nvPicPr>
+                    <pic:cNvPr id="2095629191" name=""/>
+                    <pic:cNvPicPr/>
+                  </pic:nvPicPr>
+                  <pic:blipFill>
+                    <a:blip r:embed="rId24"/>
+                    <a:stretch>
+                      <a:fillRect/>
+                    </a:stretch>
+                  </pic:blipFill>
+                  <pic:spPr>
+                    <a:xfrm>
+                      <a:off x="0" y="0"/>
+                      <a:ext cx="2472600" cy="1067746"/>
                     </a:xfrm>
                     <a:prstGeom prst="rect">
                       <a:avLst/>

</xml_diff>

<commit_message>
Made more improvements to the games
</commit_message>
<xml_diff>
--- a/Javascript learning process - Documentation.docx
+++ b/Javascript learning process - Documentation.docx
@@ -1,6 +1,6 @@
 
 <file path=word/document.xml><?xml version="1.0" encoding="utf-8"?>
-<w:document xmlns:wpc="http://schemas.microsoft.com/office/word/2010/wordprocessingCanvas" xmlns:cx="http://schemas.microsoft.com/office/drawing/2014/chartex" xmlns:cx1="http://schemas.microsoft.com/office/drawing/2015/9/8/chartex" xmlns:cx2="http://schemas.microsoft.com/office/drawing/2015/10/21/chartex" xmlns:cx3="http://schemas.microsoft.com/office/drawing/2016/5/9/chartex" xmlns:cx4="http://schemas.microsoft.com/office/drawing/2016/5/10/chartex" xmlns:cx5="http://schemas.microsoft.com/office/drawing/2016/5/11/chartex" xmlns:cx6="http://schemas.microsoft.com/office/drawing/2016/5/12/chartex" xmlns:cx7="http://schemas.microsoft.com/office/drawing/2016/5/13/chartex" xmlns:cx8="http://schemas.microsoft.com/office/drawing/2016/5/14/chartex" xmlns:mc="http://schemas.openxmlformats.org/markup-compatibility/2006" xmlns:aink="http://schemas.microsoft.com/office/drawing/2016/ink" xmlns:am3d="http://schemas.microsoft.com/office/drawing/2017/model3d" xmlns:o="urn:schemas-microsoft-com:office:office" xmlns:oel="http://schemas.microsoft.com/office/2019/extlst" xmlns:r="http://schemas.openxmlformats.org/officeDocument/2006/relationships" xmlns:m="http://schemas.openxmlformats.org/officeDocument/2006/math" xmlns:v="urn:schemas-microsoft-com:vml" xmlns:wp14="http://schemas.microsoft.com/office/word/2010/wordprocessingDrawing" xmlns:wp="http://schemas.openxmlformats.org/drawingml/2006/wordprocessingDrawing" xmlns:w10="urn:schemas-microsoft-com:office:word" xmlns:w="http://schemas.openxmlformats.org/wordprocessingml/2006/main" xmlns:w14="http://schemas.microsoft.com/office/word/2010/wordml" xmlns:w15="http://schemas.microsoft.com/office/word/2012/wordml" xmlns:w16cex="http://schemas.microsoft.com/office/word/2018/wordml/cex" xmlns:w16cid="http://schemas.microsoft.com/office/word/2016/wordml/cid" xmlns:w16="http://schemas.microsoft.com/office/word/2018/wordml" xmlns:w16du="http://schemas.microsoft.com/office/word/2023/wordml/word16du" xmlns:w16sdtdh="http://schemas.microsoft.com/office/word/2020/wordml/sdtdatahash" xmlns:w16sdtfl="http://schemas.microsoft.com/office/word/2024/wordml/sdtformatlock" xmlns:w16se="http://schemas.microsoft.com/office/word/2015/wordml/symex" xmlns:wpg="http://schemas.microsoft.com/office/word/2010/wordprocessingGroup" xmlns:wpi="http://schemas.microsoft.com/office/word/2010/wordprocessingInk" xmlns:wne="http://schemas.microsoft.com/office/word/2006/wordml" xmlns:wps="http://schemas.microsoft.com/office/word/2010/wordprocessingShape" mc:Ignorable="w14 w15 w16se w16cid w16 w16cex w16sdtdh w16sdtfl w16du wp14">
+<w:document xmlns:wpc="http://schemas.microsoft.com/office/word/2010/wordprocessingCanvas" xmlns:cx="http://schemas.microsoft.com/office/drawing/2014/chartex" xmlns:cx1="http://schemas.microsoft.com/office/drawing/2015/9/8/chartex" xmlns:cx2="http://schemas.microsoft.com/office/drawing/2015/10/21/chartex" xmlns:cx3="http://schemas.microsoft.com/office/drawing/2016/5/9/chartex" xmlns:cx4="http://schemas.microsoft.com/office/drawing/2016/5/10/chartex" xmlns:cx5="http://schemas.microsoft.com/office/drawing/2016/5/11/chartex" xmlns:cx6="http://schemas.microsoft.com/office/drawing/2016/5/12/chartex" xmlns:cx7="http://schemas.microsoft.com/office/drawing/2016/5/13/chartex" xmlns:cx8="http://schemas.microsoft.com/office/drawing/2016/5/14/chartex" xmlns:mc="http://schemas.openxmlformats.org/markup-compatibility/2006" xmlns:aink="http://schemas.microsoft.com/office/drawing/2016/ink" xmlns:am3d="http://schemas.microsoft.com/office/drawing/2017/model3d" xmlns:o="urn:schemas-microsoft-com:office:office" xmlns:oel="http://schemas.microsoft.com/office/2019/extlst" xmlns:r="http://schemas.openxmlformats.org/officeDocument/2006/relationships" xmlns:m="http://schemas.openxmlformats.org/officeDocument/2006/math" xmlns:v="urn:schemas-microsoft-com:vml" xmlns:wp14="http://schemas.microsoft.com/office/word/2010/wordprocessingDrawing" xmlns:wp="http://schemas.openxmlformats.org/drawingml/2006/wordprocessingDrawing" xmlns:w10="urn:schemas-microsoft-com:office:word" xmlns:w="http://schemas.openxmlformats.org/wordprocessingml/2006/main" xmlns:w14="http://schemas.microsoft.com/office/word/2010/wordml" xmlns:w15="http://schemas.microsoft.com/office/word/2012/wordml" xmlns:w16cei="http://schemas.microsoft.com/office/word/2026/wordml/cei" xmlns:w16cex="http://schemas.microsoft.com/office/word/2018/wordml/cex" xmlns:w16cid="http://schemas.microsoft.com/office/word/2016/wordml/cid" xmlns:w16="http://schemas.microsoft.com/office/word/2018/wordml" xmlns:w16du="http://schemas.microsoft.com/office/word/2023/wordml/word16du" xmlns:w16sdtdh="http://schemas.microsoft.com/office/word/2020/wordml/sdtdatahash" xmlns:w16sdtfl="http://schemas.microsoft.com/office/word/2024/wordml/sdtformatlock" xmlns:w16se="http://schemas.microsoft.com/office/word/2015/wordml/symex" xmlns:wpg="http://schemas.microsoft.com/office/word/2010/wordprocessingGroup" xmlns:wpi="http://schemas.microsoft.com/office/word/2010/wordprocessingInk" xmlns:wne="http://schemas.microsoft.com/office/word/2006/wordml" xmlns:wps="http://schemas.microsoft.com/office/word/2010/wordprocessingShape" mc:Ignorable="w14 w15 w16se w16cid w16 w16cex w16sdtdh w16sdtfl w16du wp14">
   <w:body>
     <w:p>
       <w:proofErr w:type="spellStart"/>
@@ -290,21 +290,58 @@
       </w:r>
       <w:proofErr w:type="gramEnd"/>
       <w:r>
-        <w:t>“I’m named ” + string + “I’m “ + var1);</w:t>
-      </w:r>
-    </w:p>
-    <w:p>
-      <w:r>
-        <w:t xml:space="preserve">with back ticks use </w:t>
+        <w:t xml:space="preserve">“I’m </w:t>
       </w:r>
       <w:proofErr w:type="gramStart"/>
       <w:r>
+        <w:t>named ”</w:t>
+      </w:r>
+      <w:proofErr w:type="gramEnd"/>
+      <w:r>
+        <w:t xml:space="preserve"> + string + “I’m </w:t>
+      </w:r>
+      <w:proofErr w:type="gramStart"/>
+      <w:r>
+        <w:t>“ +</w:t>
+      </w:r>
+      <w:proofErr w:type="gramEnd"/>
+      <w:r>
+        <w:t xml:space="preserve"> var1);</w:t>
+      </w:r>
+    </w:p>
+    <w:p>
+      <w:r>
+        <w:t xml:space="preserve">with back </w:t>
+      </w:r>
+      <w:proofErr w:type="gramStart"/>
+      <w:r>
+        <w:t>ticks</w:t>
+      </w:r>
+      <w:proofErr w:type="gramEnd"/>
+      <w:r>
+        <w:t xml:space="preserve"> use </w:t>
+      </w:r>
+      <w:proofErr w:type="gramStart"/>
+      <w:r>
         <w:t>( `</w:t>
       </w:r>
       <w:proofErr w:type="gramEnd"/>
       <w:r>
-        <w:t xml:space="preserve"> string: ${ } ` )</w:t>
-      </w:r>
+        <w:t xml:space="preserve"> string: </w:t>
+      </w:r>
+      <w:proofErr w:type="gramStart"/>
+      <w:r>
+        <w:t>${ }</w:t>
+      </w:r>
+      <w:proofErr w:type="gramEnd"/>
+      <w:r>
+        <w:t xml:space="preserve"> </w:t>
+      </w:r>
+      <w:proofErr w:type="gramStart"/>
+      <w:r>
+        <w:t>` )</w:t>
+      </w:r>
+      <w:proofErr w:type="gramEnd"/>
     </w:p>
     <w:p>
       <w:r>
@@ -1234,6 +1271,9 @@
     </w:p>
     <w:p>
       <w:r>
+        <w:rPr>
+          <w:noProof/>
+        </w:rPr>
         <w:drawing>
           <wp:inline distT="0" distB="0" distL="0" distR="0" wp14:anchorId="3808D8C2" wp14:editId="46705B19">
             <wp:extent cx="3391373" cy="2133898"/>
@@ -1279,6 +1319,9 @@
     </w:p>
     <w:p>
       <w:r>
+        <w:rPr>
+          <w:noProof/>
+        </w:rPr>
         <w:drawing>
           <wp:inline distT="0" distB="0" distL="0" distR="0" wp14:anchorId="478795E0" wp14:editId="378D8F96">
             <wp:extent cx="4848902" cy="2743583"/>
@@ -1324,6 +1367,9 @@
     </w:p>
     <w:p>
       <w:r>
+        <w:rPr>
+          <w:noProof/>
+        </w:rPr>
         <w:drawing>
           <wp:inline distT="0" distB="0" distL="0" distR="0" wp14:anchorId="3A18D819" wp14:editId="0FEAF366">
             <wp:extent cx="2443942" cy="1055370"/>
@@ -1360,6 +1406,581 @@
           </wp:inline>
         </w:drawing>
       </w:r>
+    </w:p>
+    <w:p>
+      <w:r>
+        <w:lastRenderedPageBreak/>
+        <w:t xml:space="preserve">Lesson 11 – </w:t>
+      </w:r>
+      <w:proofErr w:type="spellStart"/>
+      <w:r>
+        <w:t>todolist</w:t>
+      </w:r>
+      <w:proofErr w:type="spellEnd"/>
+    </w:p>
+    <w:p>
+      <w:r>
+        <w:drawing>
+          <wp:inline distT="0" distB="0" distL="0" distR="0" wp14:anchorId="71B95BE5" wp14:editId="6F07457E">
+            <wp:extent cx="5210902" cy="2991267"/>
+            <wp:effectExtent l="0" t="0" r="8890" b="0"/>
+            <wp:docPr id="1793448418" name="Picture 1"/>
+            <wp:cNvGraphicFramePr>
+              <a:graphicFrameLocks xmlns:a="http://schemas.openxmlformats.org/drawingml/2006/main" noChangeAspect="1"/>
+            </wp:cNvGraphicFramePr>
+            <a:graphic xmlns:a="http://schemas.openxmlformats.org/drawingml/2006/main">
+              <a:graphicData uri="http://schemas.openxmlformats.org/drawingml/2006/picture">
+                <pic:pic xmlns:pic="http://schemas.openxmlformats.org/drawingml/2006/picture">
+                  <pic:nvPicPr>
+                    <pic:cNvPr id="1793448418" name=""/>
+                    <pic:cNvPicPr/>
+                  </pic:nvPicPr>
+                  <pic:blipFill>
+                    <a:blip r:embed="rId25"/>
+                    <a:stretch>
+                      <a:fillRect/>
+                    </a:stretch>
+                  </pic:blipFill>
+                  <pic:spPr>
+                    <a:xfrm>
+                      <a:off x="0" y="0"/>
+                      <a:ext cx="5210902" cy="2991267"/>
+                    </a:xfrm>
+                    <a:prstGeom prst="rect">
+                      <a:avLst/>
+                    </a:prstGeom>
+                  </pic:spPr>
+                </pic:pic>
+              </a:graphicData>
+            </a:graphic>
+          </wp:inline>
+        </w:drawing>
+      </w:r>
+    </w:p>
+    <w:p>
+      <w:r>
+        <w:t>Ways to call an object</w:t>
+      </w:r>
+    </w:p>
+    <w:p>
+      <w:r>
+        <w:t xml:space="preserve">Takes the name and </w:t>
+      </w:r>
+      <w:proofErr w:type="spellStart"/>
+      <w:r>
+        <w:t>duedate</w:t>
+      </w:r>
+      <w:proofErr w:type="spellEnd"/>
+      <w:r>
+        <w:t xml:space="preserve"> from the object in the loop and stores them in the variables provided in the curly brackets which “name” and “</w:t>
+      </w:r>
+      <w:proofErr w:type="spellStart"/>
+      <w:r>
+        <w:t>duedate</w:t>
+      </w:r>
+      <w:proofErr w:type="spellEnd"/>
+      <w:r>
+        <w:t>” respectively</w:t>
+      </w:r>
+    </w:p>
+    <w:p>
+      <w:r>
+        <w:drawing>
+          <wp:inline distT="0" distB="0" distL="0" distR="0" wp14:anchorId="4F5EF223" wp14:editId="087BFA9D">
+            <wp:extent cx="2057687" cy="1533739"/>
+            <wp:effectExtent l="0" t="0" r="0" b="9525"/>
+            <wp:docPr id="72875569" name="Picture 1"/>
+            <wp:cNvGraphicFramePr>
+              <a:graphicFrameLocks xmlns:a="http://schemas.openxmlformats.org/drawingml/2006/main" noChangeAspect="1"/>
+            </wp:cNvGraphicFramePr>
+            <a:graphic xmlns:a="http://schemas.openxmlformats.org/drawingml/2006/main">
+              <a:graphicData uri="http://schemas.openxmlformats.org/drawingml/2006/picture">
+                <pic:pic xmlns:pic="http://schemas.openxmlformats.org/drawingml/2006/picture">
+                  <pic:nvPicPr>
+                    <pic:cNvPr id="72875569" name=""/>
+                    <pic:cNvPicPr/>
+                  </pic:nvPicPr>
+                  <pic:blipFill>
+                    <a:blip r:embed="rId26"/>
+                    <a:stretch>
+                      <a:fillRect/>
+                    </a:stretch>
+                  </pic:blipFill>
+                  <pic:spPr>
+                    <a:xfrm>
+                      <a:off x="0" y="0"/>
+                      <a:ext cx="2057687" cy="1533739"/>
+                    </a:xfrm>
+                    <a:prstGeom prst="rect">
+                      <a:avLst/>
+                    </a:prstGeom>
+                  </pic:spPr>
+                </pic:pic>
+              </a:graphicData>
+            </a:graphic>
+          </wp:inline>
+        </w:drawing>
+      </w:r>
+    </w:p>
+    <w:p/>
+    <w:p>
+      <w:r>
+        <w:drawing>
+          <wp:inline distT="0" distB="0" distL="0" distR="0" wp14:anchorId="3E658A08" wp14:editId="5CE603E5">
+            <wp:extent cx="5731510" cy="1424940"/>
+            <wp:effectExtent l="0" t="0" r="2540" b="3810"/>
+            <wp:docPr id="1516664951" name="Picture 1"/>
+            <wp:cNvGraphicFramePr>
+              <a:graphicFrameLocks xmlns:a="http://schemas.openxmlformats.org/drawingml/2006/main" noChangeAspect="1"/>
+            </wp:cNvGraphicFramePr>
+            <a:graphic xmlns:a="http://schemas.openxmlformats.org/drawingml/2006/main">
+              <a:graphicData uri="http://schemas.openxmlformats.org/drawingml/2006/picture">
+                <pic:pic xmlns:pic="http://schemas.openxmlformats.org/drawingml/2006/picture">
+                  <pic:nvPicPr>
+                    <pic:cNvPr id="1516664951" name=""/>
+                    <pic:cNvPicPr/>
+                  </pic:nvPicPr>
+                  <pic:blipFill>
+                    <a:blip r:embed="rId27"/>
+                    <a:stretch>
+                      <a:fillRect/>
+                    </a:stretch>
+                  </pic:blipFill>
+                  <pic:spPr>
+                    <a:xfrm>
+                      <a:off x="0" y="0"/>
+                      <a:ext cx="5731510" cy="1424940"/>
+                    </a:xfrm>
+                    <a:prstGeom prst="rect">
+                      <a:avLst/>
+                    </a:prstGeom>
+                  </pic:spPr>
+                </pic:pic>
+              </a:graphicData>
+            </a:graphic>
+          </wp:inline>
+        </w:drawing>
+      </w:r>
+    </w:p>
+    <w:p/>
+    <w:p/>
+    <w:p/>
+    <w:p>
+      <w:r>
+        <w:lastRenderedPageBreak/>
+        <w:t>Getting values from arrays</w:t>
+      </w:r>
+    </w:p>
+    <w:p>
+      <w:r>
+        <w:drawing>
+          <wp:inline distT="0" distB="0" distL="0" distR="0" wp14:anchorId="42860568" wp14:editId="2A8A4EDC">
+            <wp:extent cx="4601217" cy="2591162"/>
+            <wp:effectExtent l="0" t="0" r="0" b="0"/>
+            <wp:docPr id="1637351677" name="Picture 1"/>
+            <wp:cNvGraphicFramePr>
+              <a:graphicFrameLocks xmlns:a="http://schemas.openxmlformats.org/drawingml/2006/main" noChangeAspect="1"/>
+            </wp:cNvGraphicFramePr>
+            <a:graphic xmlns:a="http://schemas.openxmlformats.org/drawingml/2006/main">
+              <a:graphicData uri="http://schemas.openxmlformats.org/drawingml/2006/picture">
+                <pic:pic xmlns:pic="http://schemas.openxmlformats.org/drawingml/2006/picture">
+                  <pic:nvPicPr>
+                    <pic:cNvPr id="1637351677" name=""/>
+                    <pic:cNvPicPr/>
+                  </pic:nvPicPr>
+                  <pic:blipFill>
+                    <a:blip r:embed="rId28"/>
+                    <a:stretch>
+                      <a:fillRect/>
+                    </a:stretch>
+                  </pic:blipFill>
+                  <pic:spPr>
+                    <a:xfrm>
+                      <a:off x="0" y="0"/>
+                      <a:ext cx="4601217" cy="2591162"/>
+                    </a:xfrm>
+                    <a:prstGeom prst="rect">
+                      <a:avLst/>
+                    </a:prstGeom>
+                  </pic:spPr>
+                </pic:pic>
+              </a:graphicData>
+            </a:graphic>
+          </wp:inline>
+        </w:drawing>
+      </w:r>
+    </w:p>
+    <w:p>
+      <w:r>
+        <w:t>“</w:t>
+      </w:r>
+      <w:proofErr w:type="spellStart"/>
+      <w:r>
+        <w:t>firstValue</w:t>
+      </w:r>
+      <w:proofErr w:type="spellEnd"/>
+      <w:r>
+        <w:t>” and “</w:t>
+      </w:r>
+      <w:proofErr w:type="spellStart"/>
+      <w:r>
+        <w:t>secondValue</w:t>
+      </w:r>
+      <w:proofErr w:type="spellEnd"/>
+      <w:r>
+        <w:t>” are simply variables and</w:t>
+      </w:r>
+      <w:r>
+        <w:t xml:space="preserve"> they store the first n second elements in the array</w:t>
+      </w:r>
+    </w:p>
+    <w:p/>
+    <w:p>
+      <w:r>
+        <w:drawing>
+          <wp:inline distT="0" distB="0" distL="0" distR="0" wp14:anchorId="6789EF76" wp14:editId="31B47EC6">
+            <wp:extent cx="4591691" cy="2076740"/>
+            <wp:effectExtent l="0" t="0" r="0" b="0"/>
+            <wp:docPr id="1595687279" name="Picture 1"/>
+            <wp:cNvGraphicFramePr>
+              <a:graphicFrameLocks xmlns:a="http://schemas.openxmlformats.org/drawingml/2006/main" noChangeAspect="1"/>
+            </wp:cNvGraphicFramePr>
+            <a:graphic xmlns:a="http://schemas.openxmlformats.org/drawingml/2006/main">
+              <a:graphicData uri="http://schemas.openxmlformats.org/drawingml/2006/picture">
+                <pic:pic xmlns:pic="http://schemas.openxmlformats.org/drawingml/2006/picture">
+                  <pic:nvPicPr>
+                    <pic:cNvPr id="1595687279" name=""/>
+                    <pic:cNvPicPr/>
+                  </pic:nvPicPr>
+                  <pic:blipFill>
+                    <a:blip r:embed="rId29"/>
+                    <a:stretch>
+                      <a:fillRect/>
+                    </a:stretch>
+                  </pic:blipFill>
+                  <pic:spPr>
+                    <a:xfrm>
+                      <a:off x="0" y="0"/>
+                      <a:ext cx="4591691" cy="2076740"/>
+                    </a:xfrm>
+                    <a:prstGeom prst="rect">
+                      <a:avLst/>
+                    </a:prstGeom>
+                  </pic:spPr>
+                </pic:pic>
+              </a:graphicData>
+            </a:graphic>
+          </wp:inline>
+        </w:drawing>
+      </w:r>
+    </w:p>
+    <w:p/>
+    <w:p>
+      <w:r>
+        <w:drawing>
+          <wp:inline distT="0" distB="0" distL="0" distR="0" wp14:anchorId="73E61F40" wp14:editId="5E49D1E9">
+            <wp:extent cx="4610743" cy="1943371"/>
+            <wp:effectExtent l="0" t="0" r="0" b="0"/>
+            <wp:docPr id="524290747" name="Picture 1"/>
+            <wp:cNvGraphicFramePr>
+              <a:graphicFrameLocks xmlns:a="http://schemas.openxmlformats.org/drawingml/2006/main" noChangeAspect="1"/>
+            </wp:cNvGraphicFramePr>
+            <a:graphic xmlns:a="http://schemas.openxmlformats.org/drawingml/2006/main">
+              <a:graphicData uri="http://schemas.openxmlformats.org/drawingml/2006/picture">
+                <pic:pic xmlns:pic="http://schemas.openxmlformats.org/drawingml/2006/picture">
+                  <pic:nvPicPr>
+                    <pic:cNvPr id="524290747" name=""/>
+                    <pic:cNvPicPr/>
+                  </pic:nvPicPr>
+                  <pic:blipFill>
+                    <a:blip r:embed="rId30"/>
+                    <a:stretch>
+                      <a:fillRect/>
+                    </a:stretch>
+                  </pic:blipFill>
+                  <pic:spPr>
+                    <a:xfrm>
+                      <a:off x="0" y="0"/>
+                      <a:ext cx="4610743" cy="1943371"/>
+                    </a:xfrm>
+                    <a:prstGeom prst="rect">
+                      <a:avLst/>
+                    </a:prstGeom>
+                  </pic:spPr>
+                </pic:pic>
+              </a:graphicData>
+            </a:graphic>
+          </wp:inline>
+        </w:drawing>
+      </w:r>
+    </w:p>
+    <w:p/>
+    <w:p>
+      <w:proofErr w:type="spellStart"/>
+      <w:r>
+        <w:lastRenderedPageBreak/>
+        <w:t>setTimeout</w:t>
+      </w:r>
+      <w:proofErr w:type="spellEnd"/>
+      <w:r>
+        <w:t xml:space="preserve"> takes 2 values, a function we want to run in the future and the delay time or time taken before it runs in milliseconds (1000 </w:t>
+      </w:r>
+      <w:proofErr w:type="spellStart"/>
+      <w:r>
+        <w:t>ms</w:t>
+      </w:r>
+      <w:proofErr w:type="spellEnd"/>
+      <w:r>
+        <w:t xml:space="preserve"> = 1s)</w:t>
+      </w:r>
+    </w:p>
+    <w:p/>
+    <w:p>
+      <w:proofErr w:type="spellStart"/>
+      <w:proofErr w:type="gramStart"/>
+      <w:r>
+        <w:t>setTimeout</w:t>
+      </w:r>
+      <w:proofErr w:type="spellEnd"/>
+      <w:r>
+        <w:t>(</w:t>
+      </w:r>
+      <w:proofErr w:type="gramEnd"/>
+      <w:r>
+        <w:t>“function”, “time”)</w:t>
+      </w:r>
+    </w:p>
+    <w:p>
+      <w:proofErr w:type="spellStart"/>
+      <w:r>
+        <w:t>setTimeout</w:t>
+      </w:r>
+      <w:proofErr w:type="spellEnd"/>
+      <w:r>
+        <w:t xml:space="preserve"> is asynchronous code</w:t>
+      </w:r>
+    </w:p>
+    <w:p>
+      <w:r>
+        <w:drawing>
+          <wp:inline distT="0" distB="0" distL="0" distR="0" wp14:anchorId="79DBA5B3" wp14:editId="7A70C3EE">
+            <wp:extent cx="4096322" cy="1733792"/>
+            <wp:effectExtent l="0" t="0" r="0" b="0"/>
+            <wp:docPr id="1460960468" name="Picture 1"/>
+            <wp:cNvGraphicFramePr>
+              <a:graphicFrameLocks xmlns:a="http://schemas.openxmlformats.org/drawingml/2006/main" noChangeAspect="1"/>
+            </wp:cNvGraphicFramePr>
+            <a:graphic xmlns:a="http://schemas.openxmlformats.org/drawingml/2006/main">
+              <a:graphicData uri="http://schemas.openxmlformats.org/drawingml/2006/picture">
+                <pic:pic xmlns:pic="http://schemas.openxmlformats.org/drawingml/2006/picture">
+                  <pic:nvPicPr>
+                    <pic:cNvPr id="1460960468" name=""/>
+                    <pic:cNvPicPr/>
+                  </pic:nvPicPr>
+                  <pic:blipFill>
+                    <a:blip r:embed="rId31"/>
+                    <a:stretch>
+                      <a:fillRect/>
+                    </a:stretch>
+                  </pic:blipFill>
+                  <pic:spPr>
+                    <a:xfrm>
+                      <a:off x="0" y="0"/>
+                      <a:ext cx="4096322" cy="1733792"/>
+                    </a:xfrm>
+                    <a:prstGeom prst="rect">
+                      <a:avLst/>
+                    </a:prstGeom>
+                  </pic:spPr>
+                </pic:pic>
+              </a:graphicData>
+            </a:graphic>
+          </wp:inline>
+        </w:drawing>
+      </w:r>
+    </w:p>
+    <w:p/>
+    <w:p>
+      <w:r>
+        <w:drawing>
+          <wp:inline distT="0" distB="0" distL="0" distR="0" wp14:anchorId="3ECA72ED" wp14:editId="77A7C23D">
+            <wp:extent cx="3886742" cy="2172003"/>
+            <wp:effectExtent l="0" t="0" r="0" b="0"/>
+            <wp:docPr id="870743355" name="Picture 1"/>
+            <wp:cNvGraphicFramePr>
+              <a:graphicFrameLocks xmlns:a="http://schemas.openxmlformats.org/drawingml/2006/main" noChangeAspect="1"/>
+            </wp:cNvGraphicFramePr>
+            <a:graphic xmlns:a="http://schemas.openxmlformats.org/drawingml/2006/main">
+              <a:graphicData uri="http://schemas.openxmlformats.org/drawingml/2006/picture">
+                <pic:pic xmlns:pic="http://schemas.openxmlformats.org/drawingml/2006/picture">
+                  <pic:nvPicPr>
+                    <pic:cNvPr id="870743355" name=""/>
+                    <pic:cNvPicPr/>
+                  </pic:nvPicPr>
+                  <pic:blipFill>
+                    <a:blip r:embed="rId32"/>
+                    <a:stretch>
+                      <a:fillRect/>
+                    </a:stretch>
+                  </pic:blipFill>
+                  <pic:spPr>
+                    <a:xfrm>
+                      <a:off x="0" y="0"/>
+                      <a:ext cx="3886742" cy="2172003"/>
+                    </a:xfrm>
+                    <a:prstGeom prst="rect">
+                      <a:avLst/>
+                    </a:prstGeom>
+                  </pic:spPr>
+                </pic:pic>
+              </a:graphicData>
+            </a:graphic>
+          </wp:inline>
+        </w:drawing>
+      </w:r>
+    </w:p>
+    <w:p/>
+    <w:p>
+      <w:r>
+        <w:t xml:space="preserve">If you had </w:t>
+      </w:r>
+      <w:proofErr w:type="spellStart"/>
+      <w:proofErr w:type="gramStart"/>
+      <w:r>
+        <w:t>setTimeout</w:t>
+      </w:r>
+      <w:proofErr w:type="spellEnd"/>
+      <w:r>
+        <w:t>(</w:t>
+      </w:r>
+      <w:proofErr w:type="gramEnd"/>
+      <w:r>
+        <w:t xml:space="preserve">f, t) and another line of code below it, </w:t>
+      </w:r>
+      <w:proofErr w:type="spellStart"/>
+      <w:r>
+        <w:t>e.g</w:t>
+      </w:r>
+      <w:proofErr w:type="spellEnd"/>
+    </w:p>
+    <w:p>
+      <w:r>
+        <w:t xml:space="preserve">23   </w:t>
+      </w:r>
+      <w:proofErr w:type="spellStart"/>
+      <w:proofErr w:type="gramStart"/>
+      <w:r>
+        <w:t>setTimeout</w:t>
+      </w:r>
+      <w:proofErr w:type="spellEnd"/>
+      <w:r>
+        <w:t>(</w:t>
+      </w:r>
+      <w:proofErr w:type="gramEnd"/>
+      <w:r>
+        <w:t>f, t)</w:t>
+      </w:r>
+    </w:p>
+    <w:p>
+      <w:r>
+        <w:t>24</w:t>
+      </w:r>
+    </w:p>
+    <w:p>
+      <w:r>
+        <w:t>25   console.log(“</w:t>
+      </w:r>
+      <w:proofErr w:type="spellStart"/>
+      <w:r>
+        <w:t>nextline</w:t>
+      </w:r>
+      <w:proofErr w:type="spellEnd"/>
+      <w:r>
+        <w:t>”)</w:t>
+      </w:r>
+    </w:p>
+    <w:p/>
+    <w:p>
+      <w:r>
+        <w:t>“</w:t>
+      </w:r>
+      <w:proofErr w:type="spellStart"/>
+      <w:r>
+        <w:t>nextline</w:t>
+      </w:r>
+      <w:proofErr w:type="spellEnd"/>
+      <w:r>
+        <w:t xml:space="preserve">” would be printed first, meaning </w:t>
+      </w:r>
+      <w:proofErr w:type="spellStart"/>
+      <w:r>
+        <w:t>setTimeout</w:t>
+      </w:r>
+      <w:proofErr w:type="spellEnd"/>
+      <w:r>
+        <w:t xml:space="preserve"> doesn’t stop other code from running, it just sets a timer when it’s called then execution proceeds to the next line</w:t>
+      </w:r>
+    </w:p>
+    <w:p/>
+    <w:p>
+      <w:r>
+        <w:lastRenderedPageBreak/>
+        <w:drawing>
+          <wp:inline distT="0" distB="0" distL="0" distR="0" wp14:anchorId="709A499F" wp14:editId="6A075298">
+            <wp:extent cx="3762900" cy="1295581"/>
+            <wp:effectExtent l="0" t="0" r="0" b="0"/>
+            <wp:docPr id="1575962880" name="Picture 1"/>
+            <wp:cNvGraphicFramePr>
+              <a:graphicFrameLocks xmlns:a="http://schemas.openxmlformats.org/drawingml/2006/main" noChangeAspect="1"/>
+            </wp:cNvGraphicFramePr>
+            <a:graphic xmlns:a="http://schemas.openxmlformats.org/drawingml/2006/main">
+              <a:graphicData uri="http://schemas.openxmlformats.org/drawingml/2006/picture">
+                <pic:pic xmlns:pic="http://schemas.openxmlformats.org/drawingml/2006/picture">
+                  <pic:nvPicPr>
+                    <pic:cNvPr id="1575962880" name=""/>
+                    <pic:cNvPicPr/>
+                  </pic:nvPicPr>
+                  <pic:blipFill>
+                    <a:blip r:embed="rId33"/>
+                    <a:stretch>
+                      <a:fillRect/>
+                    </a:stretch>
+                  </pic:blipFill>
+                  <pic:spPr>
+                    <a:xfrm>
+                      <a:off x="0" y="0"/>
+                      <a:ext cx="3762900" cy="1295581"/>
+                    </a:xfrm>
+                    <a:prstGeom prst="rect">
+                      <a:avLst/>
+                    </a:prstGeom>
+                  </pic:spPr>
+                </pic:pic>
+              </a:graphicData>
+            </a:graphic>
+          </wp:inline>
+        </w:drawing>
+      </w:r>
+    </w:p>
+    <w:p>
+      <w:proofErr w:type="spellStart"/>
+      <w:proofErr w:type="gramStart"/>
+      <w:r>
+        <w:t>setInterval</w:t>
+      </w:r>
+      <w:proofErr w:type="spellEnd"/>
+      <w:r>
+        <w:t>(</w:t>
+      </w:r>
+      <w:proofErr w:type="gramEnd"/>
+      <w:r>
+        <w:t xml:space="preserve">f, t) repeats the function or code ‘f’ entered into it every ‘t’ </w:t>
+      </w:r>
+      <w:proofErr w:type="gramStart"/>
+      <w:r>
+        <w:t>milliseconds</w:t>
+      </w:r>
+      <w:proofErr w:type="gramEnd"/>
     </w:p>
     <w:sectPr>
       <w:pgSz w:w="11906" w:h="16838"/>

</xml_diff>